<commit_message>
Update SRS to match structural template from previous credentials
</commit_message>
<xml_diff>
--- a/api-monitoring-saas/SRS.docx
+++ b/api-monitoring-saas/SRS.docx
@@ -113,7 +113,50 @@
         <w:rPr>
           <w:b/>
         </w:rPr>
-        <w:t>2.2 Operating Environment</w:t>
+        <w:t>2.2.2 Typical Data Flow</w:t>
+      </w:r>
+    </w:p>
+    <w:p>
+      <w:r>
+        <w:t>1. User Input: Company admins or Employees add an API URL and configuration via the frontend dashboard.</w:t>
+      </w:r>
+    </w:p>
+    <w:p>
+      <w:r>
+        <w:t>2. Endpoint Validation: The backend validates the URL and API key.</w:t>
+      </w:r>
+    </w:p>
+    <w:p>
+      <w:r>
+        <w:t>3. Database Storage: The Flask backend stores the endpoint details with correct ownership tracking (user_id and created_by) in PostgreSQL.</w:t>
+      </w:r>
+    </w:p>
+    <w:p>
+      <w:r>
+        <w:t>4. Monitoring Cycle: The background engine fetches active endpoints and pings them at defined intervals.</w:t>
+      </w:r>
+    </w:p>
+    <w:p>
+      <w:r>
+        <w:t>5. Logging: Results (status code, latency, API key status) are logged into the monitoring_logs table.</w:t>
+      </w:r>
+    </w:p>
+    <w:p>
+      <w:r>
+        <w:t>6. Notification: If failure criteria are met (consecutive failures or rate limits), the Alert Service triggers an SMTP email to the employee and company admin.</w:t>
+      </w:r>
+    </w:p>
+    <w:p>
+      <w:r>
+        <w:t>7. Visualization: The dashboard fetches aggregated metrics via the REST API to render Chart.js graphs.</w:t>
+      </w:r>
+    </w:p>
+    <w:p>
+      <w:r>
+        <w:rPr>
+          <w:b/>
+        </w:rPr>
+        <w:t>2.2.3 User Classes and Characteristics</w:t>
       </w:r>
     </w:p>
     <w:p>
@@ -124,10 +167,294 @@
         <w:rPr>
           <w:b/>
         </w:rPr>
-        <w:t>Backend:</w:t>
+        <w:t>Company Administrators:</w:t>
       </w:r>
       <w:r>
-        <w:t xml:space="preserve"> Python (Flask/Gunicorn)</w:t>
+        <w:t xml:space="preserve"> Users who own the primary account, have full visibility over all endpoints created by the company and its employees.</w:t>
+      </w:r>
+    </w:p>
+    <w:p>
+      <w:pPr>
+        <w:pStyle w:val="ListBullet"/>
+      </w:pPr>
+      <w:r>
+        <w:rPr>
+          <w:b/>
+        </w:rPr>
+        <w:t>Employees:</w:t>
+      </w:r>
+      <w:r>
+        <w:t xml:space="preserve"> Sub-accounts invited by the Company Admin. They can add, manage, and monitor only their own specific API endpoints.</w:t>
+      </w:r>
+    </w:p>
+    <w:p>
+      <w:r>
+        <w:rPr>
+          <w:b/>
+        </w:rPr>
+        <w:t>2.2.4 Operating Environment</w:t>
+      </w:r>
+    </w:p>
+    <w:p>
+      <w:pPr>
+        <w:pStyle w:val="ListBullet"/>
+      </w:pPr>
+      <w:r>
+        <w:rPr>
+          <w:b/>
+        </w:rPr>
+        <w:t>Server Side:</w:t>
+      </w:r>
+      <w:r>
+        <w:t xml:space="preserve"> Python 3.10+, Flask, Waitress/Gunicorn, PostgreSQL (Supabase).</w:t>
+      </w:r>
+    </w:p>
+    <w:p>
+      <w:pPr>
+        <w:pStyle w:val="ListBullet"/>
+      </w:pPr>
+      <w:r>
+        <w:rPr>
+          <w:b/>
+        </w:rPr>
+        <w:t>Client Side:</w:t>
+      </w:r>
+      <w:r>
+        <w:t xml:space="preserve"> Any modern web browser (Chrome, Firefox, Safari, Edge).</w:t>
+      </w:r>
+    </w:p>
+    <w:p>
+      <w:pPr>
+        <w:pStyle w:val="ListBullet"/>
+      </w:pPr>
+      <w:r>
+        <w:rPr>
+          <w:b/>
+        </w:rPr>
+        <w:t>Hosting:</w:t>
+      </w:r>
+      <w:r>
+        <w:t xml:space="preserve"> Vercel (Web Server), Background Engine Threading.</w:t>
+      </w:r>
+    </w:p>
+    <w:p>
+      <w:r>
+        <w:rPr>
+          <w:b/>
+        </w:rPr>
+        <w:t>2.2.5 Design and Implementation Constraints / Assumptions</w:t>
+      </w:r>
+    </w:p>
+    <w:p>
+      <w:r>
+        <w:t>- The system depends on the availability of the PostgreSQL API.</w:t>
+      </w:r>
+    </w:p>
+    <w:p>
+      <w:r>
+        <w:t>- Monitoring frequency is fixed at 60 seconds.</w:t>
+      </w:r>
+    </w:p>
+    <w:p>
+      <w:r>
+        <w:t>- SMTP delivery depends on the provider (e.g., Gmail) and correct App Password configuration.</w:t>
+      </w:r>
+    </w:p>
+    <w:p>
+      <w:r>
+        <w:t>- Serverless scaling on Vercel requires custom DBWrappers to prevent connection pool starvation.</w:t>
+      </w:r>
+    </w:p>
+    <w:p>
+      <w:r>
+        <w:rPr>
+          <w:b/>
+        </w:rPr>
+        <w:t>2.2.6 How Dynamic Website Works</w:t>
+      </w:r>
+    </w:p>
+    <w:p>
+      <w:r>
+        <w:t>The system uses a Full-Stack Decoupled Architecture:</w:t>
+      </w:r>
+    </w:p>
+    <w:p>
+      <w:r>
+        <w:t>- The Frontend (HTML/CSS/JS) is a Single Page Application (SPA) style setup that communicates with the backend via fetch requests.</w:t>
+      </w:r>
+    </w:p>
+    <w:p>
+      <w:r>
+        <w:t>- The Backend (Flask) acts as a REST API server, handling authentication, data aggregation, and database logic.</w:t>
+      </w:r>
+    </w:p>
+    <w:p>
+      <w:r>
+        <w:t>- The Background Engine runs asynchronously to ensure monitoring continues even without active user sessions.</w:t>
+      </w:r>
+    </w:p>
+    <w:p>
+      <w:r>
+        <w:rPr>
+          <w:b/>
+        </w:rPr>
+        <w:t>2.2.7 Assumptions and Dependencies</w:t>
+      </w:r>
+    </w:p>
+    <w:p>
+      <w:pPr>
+        <w:pStyle w:val="ListBullet"/>
+      </w:pPr>
+      <w:r>
+        <w:rPr>
+          <w:b/>
+        </w:rPr>
+        <w:t>Assumed Browser:</w:t>
+      </w:r>
+      <w:r>
+        <w:t xml:space="preserve"> HTML5 and ES6 compatibility.</w:t>
+      </w:r>
+    </w:p>
+    <w:p>
+      <w:pPr>
+        <w:pStyle w:val="ListBullet"/>
+      </w:pPr>
+      <w:r>
+        <w:rPr>
+          <w:b/>
+        </w:rPr>
+        <w:t>Internet Discovery:</w:t>
+      </w:r>
+      <w:r>
+        <w:t xml:space="preserve"> Users must have a stable internet connection to access the dashboard.</w:t>
+      </w:r>
+    </w:p>
+    <w:p>
+      <w:pPr>
+        <w:pStyle w:val="ListBullet"/>
+      </w:pPr>
+      <w:r>
+        <w:rPr>
+          <w:b/>
+        </w:rPr>
+        <w:t>Email Service:</w:t>
+      </w:r>
+      <w:r>
+        <w:t xml:space="preserve"> Assumes the user provides a valid email address for alerts.</w:t>
+      </w:r>
+    </w:p>
+    <w:p>
+      <w:pPr>
+        <w:pStyle w:val="Heading2"/>
+      </w:pPr>
+      <w:r>
+        <w:t>2.3 Functional Requirements</w:t>
+      </w:r>
+    </w:p>
+    <w:p>
+      <w:r>
+        <w:rPr>
+          <w:b/>
+        </w:rPr>
+        <w:t>2.3.1 Core Functionality Description</w:t>
+      </w:r>
+    </w:p>
+    <w:p>
+      <w:r>
+        <w:t>The system provides a seamless experience for monitoring APIs across a company structure. Users can define endpoints (URL, Method, Interval, API keys), and the system ensures they are reachable and valid. The dashboard provides a "NOC-style" view of all monitored services, isolating data so employees only see their scope, while companies see aggregate overviews.</w:t>
+      </w:r>
+    </w:p>
+    <w:p>
+      <w:r>
+        <w:rPr>
+          <w:b/>
+        </w:rPr>
+        <w:t>2.3.2 External Interface Requirements</w:t>
+      </w:r>
+    </w:p>
+    <w:p>
+      <w:r>
+        <w:rPr>
+          <w:b/>
+        </w:rPr>
+        <w:t>2.3.2.1 User Interface</w:t>
+      </w:r>
+    </w:p>
+    <w:p>
+      <w:pPr>
+        <w:pStyle w:val="ListBullet"/>
+      </w:pPr>
+      <w:r>
+        <w:rPr>
+          <w:b/>
+        </w:rPr>
+        <w:t>Landing Page:</w:t>
+      </w:r>
+      <w:r>
+        <w:t xml:space="preserve"> Modern centered glassmorphic login/registration card.</w:t>
+      </w:r>
+    </w:p>
+    <w:p>
+      <w:pPr>
+        <w:pStyle w:val="ListBullet"/>
+      </w:pPr>
+      <w:r>
+        <w:rPr>
+          <w:b/>
+        </w:rPr>
+        <w:t>Dashboard:</w:t>
+      </w:r>
+      <w:r>
+        <w:t xml:space="preserve"> Sidebar navigation with dynamic content area, health status cards, and responsive Chart.js charts.</w:t>
+      </w:r>
+    </w:p>
+    <w:p>
+      <w:pPr>
+        <w:pStyle w:val="ListBullet"/>
+      </w:pPr>
+      <w:r>
+        <w:rPr>
+          <w:b/>
+        </w:rPr>
+        <w:t>Modals:</w:t>
+      </w:r>
+      <w:r>
+        <w:t xml:space="preserve"> For adding/editing endpoints and inviting employees.</w:t>
+      </w:r>
+    </w:p>
+    <w:p>
+      <w:r>
+        <w:rPr>
+          <w:b/>
+        </w:rPr>
+        <w:t>2.3.2.2 Hardware Interfaces</w:t>
+      </w:r>
+    </w:p>
+    <w:p>
+      <w:r>
+        <w:t>No specialized hardware required. Standard Server/PC with NIC.</w:t>
+      </w:r>
+    </w:p>
+    <w:p>
+      <w:r>
+        <w:rPr>
+          <w:b/>
+        </w:rPr>
+        <w:t>2.3.2.3 Software Interfaces</w:t>
+      </w:r>
+    </w:p>
+    <w:p>
+      <w:pPr>
+        <w:pStyle w:val="ListBullet"/>
+      </w:pPr>
+      <w:r>
+        <w:rPr>
+          <w:b/>
+        </w:rPr>
+        <w:t>Web Browser:</w:t>
+      </w:r>
+      <w:r>
+        <w:t xml:space="preserve"> Chrome 90+, Firefox 88+.</w:t>
       </w:r>
     </w:p>
     <w:p>
@@ -141,7 +468,7 @@
         <w:t>Database:</w:t>
       </w:r>
       <w:r>
-        <w:t xml:space="preserve"> PostgreSQL (Supabase/Neon)</w:t>
+        <w:t xml:space="preserve"> Supabase (PostgreSQL).</w:t>
       </w:r>
     </w:p>
     <w:p>
@@ -152,10 +479,10 @@
         <w:rPr>
           <w:b/>
         </w:rPr>
-        <w:t>Frontend:</w:t>
+        <w:t>Backend Framework:</w:t>
       </w:r>
       <w:r>
-        <w:t xml:space="preserve"> HTML, CSS, JavaScript (Vanilla/Chart.js)</w:t>
+        <w:t xml:space="preserve"> Flask (Python).</w:t>
       </w:r>
     </w:p>
     <w:p>
@@ -166,18 +493,10 @@
         <w:rPr>
           <w:b/>
         </w:rPr>
-        <w:t>Deployment:</w:t>
+        <w:t>Libraries:</w:t>
       </w:r>
       <w:r>
-        <w:t xml:space="preserve"> Vercel (Web Server), Independent Cron/Worker Threads for monitoring tasks.</w:t>
-      </w:r>
-    </w:p>
-    <w:p>
-      <w:pPr>
-        <w:pStyle w:val="Heading2"/>
-      </w:pPr>
-      <w:r>
-        <w:t>3. Functional Requirements</w:t>
+        <w:t xml:space="preserve"> Chart.js for visualization, APScheduler for tasks.</w:t>
       </w:r>
     </w:p>
     <w:p>
@@ -185,7 +504,7 @@
         <w:rPr>
           <w:b/>
         </w:rPr>
-        <w:t>3.1 Authentication &amp; Authorization</w:t>
+        <w:t>2.3.2.4 Communication Interfaces</w:t>
       </w:r>
     </w:p>
     <w:p>
@@ -196,10 +515,10 @@
         <w:rPr>
           <w:b/>
         </w:rPr>
-        <w:t>REQ-1:</w:t>
+        <w:t>HTTP/HTTPS:</w:t>
       </w:r>
       <w:r>
-        <w:t xml:space="preserve"> The system shall support secure registration via email OTP.</w:t>
+        <w:t xml:space="preserve"> For client-server communication and API pings.</w:t>
       </w:r>
     </w:p>
     <w:p>
@@ -210,10 +529,147 @@
         <w:rPr>
           <w:b/>
         </w:rPr>
-        <w:t>REQ-2:</w:t>
+        <w:t>SMTP:</w:t>
       </w:r>
       <w:r>
-        <w:t xml:space="preserve"> The system shall authenticate users via JWT tokens.</w:t>
+        <w:t xml:space="preserve"> For sending critical failure alerts.</w:t>
+      </w:r>
+    </w:p>
+    <w:p>
+      <w:r>
+        <w:rPr>
+          <w:b/>
+        </w:rPr>
+        <w:t>2.3.3 Detailed Functional Requirements</w:t>
+      </w:r>
+    </w:p>
+    <w:p>
+      <w:r>
+        <w:rPr>
+          <w:b/>
+        </w:rPr>
+        <w:t>2.3.3.1 Web Pages Identified</w:t>
+      </w:r>
+    </w:p>
+    <w:p>
+      <w:r>
+        <w:t>- `login.html`: Entry point for all users.</w:t>
+      </w:r>
+    </w:p>
+    <w:p>
+      <w:r>
+        <w:t>- `admin.html`: The main control center showing global stats, charts, and endpoint controls.</w:t>
+      </w:r>
+    </w:p>
+    <w:p>
+      <w:pPr>
+        <w:pStyle w:val="Heading2"/>
+      </w:pPr>
+      <w:r>
+        <w:t>Non-Functional Requirements</w:t>
+      </w:r>
+    </w:p>
+    <w:p>
+      <w:r>
+        <w:rPr>
+          <w:b/>
+        </w:rPr>
+        <w:t>Security:</w:t>
+      </w:r>
+    </w:p>
+    <w:p>
+      <w:r>
+        <w:t>- Password hashing using bcrypt.</w:t>
+      </w:r>
+    </w:p>
+    <w:p>
+      <w:r>
+        <w:t>- Authorization via JWT in headers.</w:t>
+      </w:r>
+    </w:p>
+    <w:p>
+      <w:r>
+        <w:t>- Multi-Tenant Isolation using `company_id` and `created_by` attributes.</w:t>
+      </w:r>
+    </w:p>
+    <w:p>
+      <w:r>
+        <w:t>- API key masking in all responses (only first 4 and last 4 characters shown).</w:t>
+      </w:r>
+    </w:p>
+    <w:p>
+      <w:r>
+        <w:t>- Secure connection pool management.</w:t>
+      </w:r>
+    </w:p>
+    <w:p>
+      <w:r>
+        <w:rPr>
+          <w:b/>
+        </w:rPr>
+        <w:t>Performance:</w:t>
+      </w:r>
+    </w:p>
+    <w:p>
+      <w:r>
+        <w:t>- API health check responses logged in less than 500ms.</w:t>
+      </w:r>
+    </w:p>
+    <w:p>
+      <w:r>
+        <w:t>- Dashboard stats aggregation returned in under 200ms using caching.</w:t>
+      </w:r>
+    </w:p>
+    <w:p>
+      <w:r>
+        <w:rPr>
+          <w:b/>
+        </w:rPr>
+        <w:t>Scalability:</w:t>
+      </w:r>
+    </w:p>
+    <w:p>
+      <w:r>
+        <w:t>- PostgreSQL handles concurrent database connections reliably.</w:t>
+      </w:r>
+    </w:p>
+    <w:p>
+      <w:r>
+        <w:t>- Flask backend is stateless for horizontal serverless scaling.</w:t>
+      </w:r>
+    </w:p>
+    <w:p>
+      <w:r>
+        <w:rPr>
+          <w:b/>
+        </w:rPr>
+        <w:t>Availability:</w:t>
+      </w:r>
+    </w:p>
+    <w:p>
+      <w:r>
+        <w:t>- Background monitoring engine ensures 24/7 pings.</w:t>
+      </w:r>
+    </w:p>
+    <w:p>
+      <w:r>
+        <w:rPr>
+          <w:b/>
+        </w:rPr>
+        <w:t>Usability:</w:t>
+      </w:r>
+    </w:p>
+    <w:p>
+      <w:r>
+        <w:t>- Clean, premium design with intuitive navigation.</w:t>
+      </w:r>
+    </w:p>
+    <w:p>
+      <w:pPr>
+        <w:pStyle w:val="Heading2"/>
+      </w:pPr>
+      <w:r>
+        <w:t>2.4 Advantages of the System</w:t>
       </w:r>
     </w:p>
     <w:p>
@@ -224,10 +680,10 @@
         <w:rPr>
           <w:b/>
         </w:rPr>
-        <w:t>REQ-3:</w:t>
+        <w:t>Real-time Awareness:</w:t>
       </w:r>
       <w:r>
-        <w:t xml:space="preserve"> Company Admins must be able to invite Employee users.</w:t>
+        <w:t xml:space="preserve"> Users know immediately when their API is down or degrading.</w:t>
       </w:r>
     </w:p>
     <w:p>
@@ -238,10 +694,10 @@
         <w:rPr>
           <w:b/>
         </w:rPr>
-        <w:t>REQ-4:</w:t>
+        <w:t>Data-Driven Insights:</w:t>
       </w:r>
       <w:r>
-        <w:t xml:space="preserve"> Employees shall only access and modify their own endpoints.</w:t>
+        <w:t xml:space="preserve"> Uptime and latency charts help identify performance regressions.</w:t>
       </w:r>
     </w:p>
     <w:p>
@@ -252,18 +708,10 @@
         <w:rPr>
           <w:b/>
         </w:rPr>
-        <w:t>REQ-5:</w:t>
+        <w:t>Corporate Hierarchy Control:</w:t>
       </w:r>
       <w:r>
-        <w:t xml:space="preserve"> Company Admins shall have read-only access to their employees' endpoints and aggregated statistical data.</w:t>
-      </w:r>
-    </w:p>
-    <w:p>
-      <w:r>
-        <w:rPr>
-          <w:b/>
-        </w:rPr>
-        <w:t>3.2 API Endpoint Management</w:t>
+        <w:t xml:space="preserve"> Perfect data isolation between company admins and employee sub-accounts.</w:t>
       </w:r>
     </w:p>
     <w:p>
@@ -274,10 +722,18 @@
         <w:rPr>
           <w:b/>
         </w:rPr>
-        <w:t>REQ-6:</w:t>
+        <w:t>Secure by Design:</w:t>
       </w:r>
       <w:r>
-        <w:t xml:space="preserve"> Users shall be able to Create, Read, Update, and Delete (CRUD) API configurations (URL, Method, API Key Header, API Key).</w:t>
+        <w:t xml:space="preserve"> Implementation of strict RBAC ensures user data privacy.</w:t>
+      </w:r>
+    </w:p>
+    <w:p>
+      <w:pPr>
+        <w:pStyle w:val="Heading2"/>
+      </w:pPr>
+      <w:r>
+        <w:t>2.5 Future Enhancements</w:t>
       </w:r>
     </w:p>
     <w:p>
@@ -288,18 +744,10 @@
         <w:rPr>
           <w:b/>
         </w:rPr>
-        <w:t>REQ-7:</w:t>
+        <w:t>Multi-region Pings:</w:t>
       </w:r>
       <w:r>
-        <w:t xml:space="preserve"> All stored API keys must be encrypted or masked during transmission and retrieval to prevent unauthorized exposure.</w:t>
-      </w:r>
-    </w:p>
-    <w:p>
-      <w:r>
-        <w:rPr>
-          <w:b/>
-        </w:rPr>
-        <w:t>3.3 Monitoring Engine</w:t>
+        <w:t xml:space="preserve"> Monitor APIs from different global locations.</w:t>
       </w:r>
     </w:p>
     <w:p>
@@ -310,10 +758,10 @@
         <w:rPr>
           <w:b/>
         </w:rPr>
-        <w:t>REQ-8:</w:t>
+        <w:t>Slack/Discord Webhooks:</w:t>
       </w:r>
       <w:r>
-        <w:t xml:space="preserve"> A background worker thread shall continuously execute HTTP calls based on each endpoint's defined `interval`.</w:t>
+        <w:t xml:space="preserve"> Notification support for dev teams.</w:t>
       </w:r>
     </w:p>
     <w:p>
@@ -324,10 +772,10 @@
         <w:rPr>
           <w:b/>
         </w:rPr>
-        <w:t>REQ-9:</w:t>
+        <w:t>AI Diagnostics:</w:t>
       </w:r>
       <w:r>
-        <w:t xml:space="preserve"> The engine shall log HTTP status codes, latency, and success booleans into a historical database table.</w:t>
+        <w:t xml:space="preserve"> Automatically analyze root causes of failures.</w:t>
       </w:r>
     </w:p>
     <w:p>
@@ -338,162 +786,10 @@
         <w:rPr>
           <w:b/>
         </w:rPr>
-        <w:t>REQ-10:</w:t>
+        <w:t>Mobile Application:</w:t>
       </w:r>
       <w:r>
-        <w:t xml:space="preserve"> Consecutive failures shall be tracked up to a customizable threshold before an alert is escalated.</w:t>
-      </w:r>
-    </w:p>
-    <w:p>
-      <w:r>
-        <w:rPr>
-          <w:b/>
-        </w:rPr>
-        <w:t>3.4 Analytics &amp; Reporting</w:t>
-      </w:r>
-    </w:p>
-    <w:p>
-      <w:pPr>
-        <w:pStyle w:val="ListBullet"/>
-      </w:pPr>
-      <w:r>
-        <w:rPr>
-          <w:b/>
-        </w:rPr>
-        <w:t>REQ-11:</w:t>
-      </w:r>
-      <w:r>
-        <w:t xml:space="preserve"> The system shall aggregate data from `monitoring_logs` to output a total Uptime Percentage per endpoint.</w:t>
-      </w:r>
-    </w:p>
-    <w:p>
-      <w:pPr>
-        <w:pStyle w:val="ListBullet"/>
-      </w:pPr>
-      <w:r>
-        <w:rPr>
-          <w:b/>
-        </w:rPr>
-        <w:t>REQ-12:</w:t>
-      </w:r>
-      <w:r>
-        <w:t xml:space="preserve"> The analytics engine shall use Redis/in-memory caching to optimize heavy aggregate queries (e.g., P50/P95 latencies).</w:t>
-      </w:r>
-    </w:p>
-    <w:p>
-      <w:pPr>
-        <w:pStyle w:val="Heading2"/>
-      </w:pPr>
-      <w:r>
-        <w:t>4. Non-Functional Requirements</w:t>
-      </w:r>
-    </w:p>
-    <w:p>
-      <w:r>
-        <w:rPr>
-          <w:b/>
-        </w:rPr>
-        <w:t>4.1 Performance &amp; Scalability</w:t>
-      </w:r>
-    </w:p>
-    <w:p>
-      <w:pPr>
-        <w:pStyle w:val="ListBullet"/>
-      </w:pPr>
-      <w:r>
-        <w:rPr>
-          <w:b/>
-        </w:rPr>
-        <w:t>NFR-1:</w:t>
-      </w:r>
-      <w:r>
-        <w:t xml:space="preserve"> Dashboard statistics must return within 200ms using caching mechanisms.</w:t>
-      </w:r>
-    </w:p>
-    <w:p>
-      <w:pPr>
-        <w:pStyle w:val="ListBullet"/>
-      </w:pPr>
-      <w:r>
-        <w:rPr>
-          <w:b/>
-        </w:rPr>
-        <w:t>NFR-2:</w:t>
-      </w:r>
-      <w:r>
-        <w:t xml:space="preserve"> The monitoring engine must parallelize HTTP checks using thread pools to ensure large endpoint numbers don't cause drift in polling intervals.</w:t>
-      </w:r>
-    </w:p>
-    <w:p>
-      <w:r>
-        <w:rPr>
-          <w:b/>
-        </w:rPr>
-        <w:t>4.2 Security</w:t>
-      </w:r>
-    </w:p>
-    <w:p>
-      <w:pPr>
-        <w:pStyle w:val="ListBullet"/>
-      </w:pPr>
-      <w:r>
-        <w:rPr>
-          <w:b/>
-        </w:rPr>
-        <w:t>NFR-3:</w:t>
-      </w:r>
-      <w:r>
-        <w:t xml:space="preserve"> Passwords must be hashed using `bcrypt` algorithms.</w:t>
-      </w:r>
-    </w:p>
-    <w:p>
-      <w:pPr>
-        <w:pStyle w:val="ListBullet"/>
-      </w:pPr>
-      <w:r>
-        <w:rPr>
-          <w:b/>
-        </w:rPr>
-        <w:t>NFR-4:</w:t>
-      </w:r>
-      <w:r>
-        <w:t xml:space="preserve"> API requests shall utilize standard HTTPS.</w:t>
-      </w:r>
-    </w:p>
-    <w:p>
-      <w:r>
-        <w:rPr>
-          <w:b/>
-        </w:rPr>
-        <w:t>4.3 Reliability &amp; Availability</w:t>
-      </w:r>
-    </w:p>
-    <w:p>
-      <w:pPr>
-        <w:pStyle w:val="ListBullet"/>
-      </w:pPr>
-      <w:r>
-        <w:rPr>
-          <w:b/>
-        </w:rPr>
-        <w:t>NFR-5:</w:t>
-      </w:r>
-      <w:r>
-        <w:t xml:space="preserve"> The core Web API must isolate its PostgreSQL connection pooling to ensure it does not starve connection slots during serverless scaling events (using a custom `DBWrapper`).</w:t>
-      </w:r>
-    </w:p>
-    <w:p>
-      <w:pPr>
-        <w:pStyle w:val="ListBullet"/>
-      </w:pPr>
-      <w:r>
-        <w:rPr>
-          <w:b/>
-        </w:rPr>
-        <w:t>NFR-6:</w:t>
-      </w:r>
-      <w:r>
-        <w:t xml:space="preserve"> Multi-tenant degradation load test coverage must enforce SLA guarantees on response time spikes.</w:t>
+        <w:t xml:space="preserve"> Native iOS/Android app for on-the-go alerts.</w:t>
       </w:r>
     </w:p>
     <w:sectPr>

</xml_diff>

<commit_message>
Update SRS to 100% complete text mapping of VSCode PDF
</commit_message>
<xml_diff>
--- a/api-monitoring-saas/SRS.docx
+++ b/api-monitoring-saas/SRS.docx
@@ -15,7 +15,7 @@
         <w:pStyle w:val="Heading1"/>
       </w:pPr>
       <w:r>
-        <w:t>API Monitoring SaaS Platform</w:t>
+        <w:t>2.1 Introduction</w:t>
       </w:r>
     </w:p>
     <w:p>
@@ -23,33 +23,12 @@
         <w:pStyle w:val="Heading2"/>
       </w:pPr>
       <w:r>
-        <w:t>1. Introduction</w:t>
+        <w:t>2.1.1 Purpose</w:t>
       </w:r>
     </w:p>
     <w:p>
       <w:r>
-        <w:rPr>
-          <w:b/>
-        </w:rPr>
-        <w:t>1.1 Purpose</w:t>
-      </w:r>
-    </w:p>
-    <w:p>
-      <w:r>
-        <w:t>The purpose of this document is to outline the software requirements for the API Monitoring Software as a Service (SaaS) platform. This platform enables companies to register their APIs, assign them to employee accounts, monitor real-time uptime, response times, and key health statuses, and receive instant alerts when anomalies occur.</w:t>
-      </w:r>
-    </w:p>
-    <w:p>
-      <w:r>
-        <w:rPr>
-          <w:b/>
-        </w:rPr>
-        <w:t>1.2 Scope</w:t>
-      </w:r>
-    </w:p>
-    <w:p>
-      <w:r>
-        <w:t>The SaaS application consists of a full-stack web interface with role-based access control, real-time background monitoring engines, and an analytics dashboard. It monitors APIs via HTTP checks, validates third-party API keys (e.g., OpenAI, Stripe), tracks slow load degradation, caches analytics, and sends email alerts upon failures.</w:t>
+        <w:t>The purpose of this document is to provide a comprehensive description of the API Monitor SaaS system. It outlines the functional and non-functional requirements, design constraints, and system interfaces. This document serves as a guide for developers, administrators, and stakeholders (including project guides and evaluators) to understand the system's architecture and capabilities.</w:t>
       </w:r>
     </w:p>
     <w:p>
@@ -57,105 +36,525 @@
         <w:pStyle w:val="Heading2"/>
       </w:pPr>
       <w:r>
-        <w:t>2. Overall Description</w:t>
+        <w:t>2.1.2 Scope</w:t>
       </w:r>
     </w:p>
     <w:p>
       <w:r>
+        <w:t>The API Monitor SaaS is a specialized platform designed to provide real-time health monitoring for web APIs. It allows users to register, manage their API endpoints, visualize performance metrics (uptime, response times), and receive instant notifications via email when an endpoint fails. The system includes a multi-layer security engine that uses DNS resolution and VirusTotal integration to reject dummy or fake API endpoints, ensuring only legitimate services are monitored. The system aims to minimize downtime for developers and businesses by providing an automated monitoring engine. Additionally, it features a Multi-Tenant Role-Based Access Control (RBAC) system allowing companies to invite employees, enabling scoped management of API endpoints while retaining aggregate oversight for company administrators.</w:t>
+      </w:r>
+    </w:p>
+    <w:p>
+      <w:pPr>
+        <w:pStyle w:val="Heading2"/>
+      </w:pPr>
+      <w:r>
+        <w:t>2.1.3 Acronyms and Abbreviations</w:t>
+      </w:r>
+    </w:p>
+    <w:p>
+      <w:pPr>
+        <w:pStyle w:val="ListBullet"/>
+      </w:pPr>
+      <w:r>
         <w:rPr>
           <w:b/>
         </w:rPr>
-        <w:t>2.1 Product Features</w:t>
+        <w:t>SRS</w:t>
+      </w:r>
+      <w:r>
+        <w:t>: Software Requirement Specification</w:t>
+      </w:r>
+    </w:p>
+    <w:p>
+      <w:pPr>
+        <w:pStyle w:val="ListBullet"/>
+      </w:pPr>
+      <w:r>
+        <w:rPr>
+          <w:b/>
+        </w:rPr>
+        <w:t>API</w:t>
+      </w:r>
+      <w:r>
+        <w:t>: Application Programming Interface</w:t>
+      </w:r>
+    </w:p>
+    <w:p>
+      <w:pPr>
+        <w:pStyle w:val="ListBullet"/>
+      </w:pPr>
+      <w:r>
+        <w:rPr>
+          <w:b/>
+        </w:rPr>
+        <w:t>SaaS</w:t>
+      </w:r>
+      <w:r>
+        <w:t>: Software as a Service</w:t>
+      </w:r>
+    </w:p>
+    <w:p>
+      <w:pPr>
+        <w:pStyle w:val="ListBullet"/>
+      </w:pPr>
+      <w:r>
+        <w:rPr>
+          <w:b/>
+        </w:rPr>
+        <w:t>JWT</w:t>
+      </w:r>
+      <w:r>
+        <w:t>: JSON Web Token</w:t>
+      </w:r>
+    </w:p>
+    <w:p>
+      <w:pPr>
+        <w:pStyle w:val="ListBullet"/>
+      </w:pPr>
+      <w:r>
+        <w:rPr>
+          <w:b/>
+        </w:rPr>
+        <w:t>SMTP</w:t>
+      </w:r>
+      <w:r>
+        <w:t>: Simple Mail Transfer Protocol</w:t>
+      </w:r>
+    </w:p>
+    <w:p>
+      <w:pPr>
+        <w:pStyle w:val="ListBullet"/>
+      </w:pPr>
+      <w:r>
+        <w:rPr>
+          <w:b/>
+        </w:rPr>
+        <w:t>RBAC</w:t>
+      </w:r>
+      <w:r>
+        <w:t>: Role-Based Access Control</w:t>
+      </w:r>
+    </w:p>
+    <w:p>
+      <w:pPr>
+        <w:pStyle w:val="ListBullet"/>
+      </w:pPr>
+      <w:r>
+        <w:rPr>
+          <w:b/>
+        </w:rPr>
+        <w:t>RLS</w:t>
+      </w:r>
+      <w:r>
+        <w:t>: Row Level Security</w:t>
+      </w:r>
+    </w:p>
+    <w:p>
+      <w:pPr>
+        <w:pStyle w:val="ListBullet"/>
+      </w:pPr>
+      <w:r>
+        <w:rPr>
+          <w:b/>
+        </w:rPr>
+        <w:t>SQL</w:t>
+      </w:r>
+      <w:r>
+        <w:t>: Structured Query Language</w:t>
+      </w:r>
+    </w:p>
+    <w:p>
+      <w:pPr>
+        <w:pStyle w:val="ListBullet"/>
+      </w:pPr>
+      <w:r>
+        <w:rPr>
+          <w:b/>
+        </w:rPr>
+        <w:t>CRUD</w:t>
+      </w:r>
+      <w:r>
+        <w:t>: Create, Read, Update, Delete</w:t>
+      </w:r>
+    </w:p>
+    <w:p>
+      <w:pPr>
+        <w:pStyle w:val="ListBullet"/>
+      </w:pPr>
+      <w:r>
+        <w:rPr>
+          <w:b/>
+        </w:rPr>
+        <w:t>UI</w:t>
+      </w:r>
+      <w:r>
+        <w:t>: User Interface</w:t>
+      </w:r>
+    </w:p>
+    <w:p>
+      <w:pPr>
+        <w:pStyle w:val="ListBullet"/>
+      </w:pPr>
+      <w:r>
+        <w:rPr>
+          <w:b/>
+        </w:rPr>
+        <w:t>OTP</w:t>
+      </w:r>
+      <w:r>
+        <w:t>: One-Time Password</w:t>
+      </w:r>
+    </w:p>
+    <w:p>
+      <w:pPr>
+        <w:pStyle w:val="ListBullet"/>
+      </w:pPr>
+      <w:r>
+        <w:rPr>
+          <w:b/>
+        </w:rPr>
+        <w:t>DNS</w:t>
+      </w:r>
+      <w:r>
+        <w:t>: Domain Name System</w:t>
+      </w:r>
+    </w:p>
+    <w:p>
+      <w:pPr>
+        <w:pStyle w:val="ListBullet"/>
+      </w:pPr>
+      <w:r>
+        <w:rPr>
+          <w:b/>
+        </w:rPr>
+        <w:t>VT</w:t>
+      </w:r>
+      <w:r>
+        <w:t>: VirusTotal</w:t>
+      </w:r>
+    </w:p>
+    <w:p>
+      <w:pPr>
+        <w:pStyle w:val="Heading2"/>
+      </w:pPr>
+      <w:r>
+        <w:t>2.1.4 Overview</w:t>
       </w:r>
     </w:p>
     <w:p>
       <w:r>
-        <w:t>1. Multi-tenant Role-Based Access Control (RBAC): Company Admins can invite employees, manage subscriptions, and view all system endpoints. Employees can manage and view only their assigned endpoints.</w:t>
+        <w:t>The document is organized into several sections:</w:t>
+      </w:r>
+    </w:p>
+    <w:p>
+      <w:pPr>
+        <w:pStyle w:val="ListBullet"/>
+      </w:pPr>
+      <w:r>
+        <w:rPr>
+          <w:b/>
+        </w:rPr>
+        <w:t>Section 2.1</w:t>
+      </w:r>
+      <w:r>
+        <w:t xml:space="preserve"> introduces the project and its scope.</w:t>
+      </w:r>
+    </w:p>
+    <w:p>
+      <w:pPr>
+        <w:pStyle w:val="ListBullet"/>
+      </w:pPr>
+      <w:r>
+        <w:rPr>
+          <w:b/>
+        </w:rPr>
+        <w:t>Section 2.2</w:t>
+      </w:r>
+      <w:r>
+        <w:t xml:space="preserve"> describes the overall system, product functions, and operating environment.</w:t>
+      </w:r>
+    </w:p>
+    <w:p>
+      <w:pPr>
+        <w:pStyle w:val="ListBullet"/>
+      </w:pPr>
+      <w:r>
+        <w:rPr>
+          <w:b/>
+        </w:rPr>
+        <w:t>Section 2.3</w:t>
+      </w:r>
+      <w:r>
+        <w:t xml:space="preserve"> details the functional requirements and external interfaces.</w:t>
+      </w:r>
+    </w:p>
+    <w:p>
+      <w:pPr>
+        <w:pStyle w:val="ListBullet"/>
+      </w:pPr>
+      <w:r>
+        <w:rPr>
+          <w:b/>
+        </w:rPr>
+        <w:t>Non-Functional Requirements</w:t>
+      </w:r>
+      <w:r>
+        <w:t xml:space="preserve"> covers performance, security, and quality attributes.</w:t>
+      </w:r>
+    </w:p>
+    <w:p>
+      <w:pPr>
+        <w:pStyle w:val="ListBullet"/>
+      </w:pPr>
+      <w:r>
+        <w:rPr>
+          <w:b/>
+        </w:rPr>
+        <w:t>Section 2.4</w:t>
+      </w:r>
+      <w:r>
+        <w:t xml:space="preserve"> summarizes the system's advantages.</w:t>
+      </w:r>
+    </w:p>
+    <w:p>
+      <w:pPr>
+        <w:pStyle w:val="ListBullet"/>
+      </w:pPr>
+      <w:r>
+        <w:rPr>
+          <w:b/>
+        </w:rPr>
+        <w:t>Section 2.5</w:t>
+      </w:r>
+      <w:r>
+        <w:t xml:space="preserve"> outlines future scope.</w:t>
+      </w:r>
+    </w:p>
+    <w:p>
+      <w:pPr>
+        <w:pStyle w:val="Heading1"/>
+      </w:pPr>
+      <w:r>
+        <w:t>2.2 Overall Description</w:t>
+      </w:r>
+    </w:p>
+    <w:p>
+      <w:pPr>
+        <w:pStyle w:val="Heading2"/>
+      </w:pPr>
+      <w:r>
+        <w:t>2.2.1 Product Functions</w:t>
       </w:r>
     </w:p>
     <w:p>
       <w:r>
-        <w:t>2. API Endpoint Monitoring: Real-time polling to verify status codes, response times, and API key validities.</w:t>
+        <w:t>The main functions of the system include:</w:t>
       </w:r>
     </w:p>
     <w:p>
-      <w:r>
-        <w:t>3. Third-Party API Key Validation: Integrations specifically detecting `INVALID`, `LIMITED`, and `RATE_LIMITED` HTTP signatures for external providers.</w:t>
-      </w:r>
-    </w:p>
-    <w:p>
-      <w:r>
-        <w:t>4. Performance Degradation Detection: Algorithmic identification of progressively slowing response times under load before a total timeout occurs.</w:t>
-      </w:r>
-    </w:p>
-    <w:p>
-      <w:r>
-        <w:t>5. Real-time Analytics Dashboard: Data visualization charts for Uptime, Average Response Times, and Error Rates.</w:t>
-      </w:r>
-    </w:p>
-    <w:p>
-      <w:r>
-        <w:t>6. Alert Notification System: SMTP email alerts dispatched to API owners when APIs go down or keys become invalid.</w:t>
-      </w:r>
-    </w:p>
-    <w:p>
-      <w:r>
-        <w:t>7. Background Cron Execution: Scheduled tasks running at specific intervals (e.g., every 60s) to perform the endpoint checks without blocking the main web server.</w:t>
-      </w:r>
-    </w:p>
-    <w:p>
-      <w:r>
-        <w:t>8. Automated Data Purging: Regular garbage collection of expired email verification OTPs and old endpoint monitoring logs to preserve database efficiency.</w:t>
-      </w:r>
-    </w:p>
-    <w:p>
+      <w:pPr>
+        <w:pStyle w:val="ListBullet"/>
+      </w:pPr>
       <w:r>
         <w:rPr>
           <w:b/>
         </w:rPr>
+        <w:t>User Authentication</w:t>
+      </w:r>
+      <w:r>
+        <w:t>: Secure registration and login using JWT and email OTP verification.</w:t>
+      </w:r>
+    </w:p>
+    <w:p>
+      <w:pPr>
+        <w:pStyle w:val="ListBullet"/>
+      </w:pPr>
+      <w:r>
+        <w:rPr>
+          <w:b/>
+        </w:rPr>
+        <w:t>Multi-Tenant Hierarchy</w:t>
+      </w:r>
+      <w:r>
+        <w:t>: Company Admins can invite employees. Employees manage specific subsets of APIs, while the company retains full analytics tracking.</w:t>
+      </w:r>
+    </w:p>
+    <w:p>
+      <w:pPr>
+        <w:pStyle w:val="ListBullet"/>
+      </w:pPr>
+      <w:r>
+        <w:rPr>
+          <w:b/>
+        </w:rPr>
+        <w:t>Endpoint Management</w:t>
+      </w:r>
+      <w:r>
+        <w:t>: CRUD operations for API endpoints to be monitored.</w:t>
+      </w:r>
+    </w:p>
+    <w:p>
+      <w:pPr>
+        <w:pStyle w:val="ListBullet"/>
+      </w:pPr>
+      <w:r>
+        <w:rPr>
+          <w:b/>
+        </w:rPr>
+        <w:t>Automated Monitoring</w:t>
+      </w:r>
+      <w:r>
+        <w:t>: Background engine performing health checks every 60 seconds without blocking the web server.</w:t>
+      </w:r>
+    </w:p>
+    <w:p>
+      <w:pPr>
+        <w:pStyle w:val="ListBullet"/>
+      </w:pPr>
+      <w:r>
+        <w:rPr>
+          <w:b/>
+        </w:rPr>
+        <w:t>Alerting System</w:t>
+      </w:r>
+      <w:r>
+        <w:t>: Automated SMTP email notifications on status changes (down/up).</w:t>
+      </w:r>
+    </w:p>
+    <w:p>
+      <w:pPr>
+        <w:pStyle w:val="ListBullet"/>
+      </w:pPr>
+      <w:r>
+        <w:rPr>
+          <w:b/>
+        </w:rPr>
+        <w:t>Data Visualization</w:t>
+      </w:r>
+      <w:r>
+        <w:t>: Interactive Chart.js charts for response time and uptime analysis with sub-200ms caching.</w:t>
+      </w:r>
+    </w:p>
+    <w:p>
+      <w:pPr>
+        <w:pStyle w:val="ListBullet"/>
+      </w:pPr>
+      <w:r>
+        <w:rPr>
+          <w:b/>
+        </w:rPr>
+        <w:t>Profile Management</w:t>
+      </w:r>
+      <w:r>
+        <w:t>: User profile updates and security settings.</w:t>
+      </w:r>
+    </w:p>
+    <w:p>
+      <w:pPr>
+        <w:pStyle w:val="ListBullet"/>
+      </w:pPr>
+      <w:r>
+        <w:rPr>
+          <w:b/>
+        </w:rPr>
+        <w:t>Dummy API Detection</w:t>
+      </w:r>
+      <w:r>
+        <w:t>: A 3-layer validation engine (Static Blacklist, DNS Resolution, VirusTotal Reputation) that rejects fake, mock, or non-existent API endpoints during the addition phase.</w:t>
+      </w:r>
+    </w:p>
+    <w:p>
+      <w:pPr>
+        <w:pStyle w:val="ListBullet"/>
+      </w:pPr>
+      <w:r>
+        <w:rPr>
+          <w:b/>
+        </w:rPr>
+        <w:t>API Key Validation</w:t>
+      </w:r>
+      <w:r>
+        <w:t>: Pre-flight validation of user-supplied API keys before storing them, with pattern matching for known test key formats (e.g., detecting INVALID or RATE_LIMITED states).</w:t>
+      </w:r>
+    </w:p>
+    <w:p>
+      <w:pPr>
+        <w:pStyle w:val="ListBullet"/>
+      </w:pPr>
+      <w:r>
+        <w:rPr>
+          <w:b/>
+        </w:rPr>
+        <w:t>Degradation Analysis</w:t>
+      </w:r>
+      <w:r>
+        <w:t>: Monitoring engine dynamically tracks and alerts upon progressively slower API response times before hard timeouts occur.</w:t>
+      </w:r>
+    </w:p>
+    <w:p>
+      <w:pPr>
+        <w:pStyle w:val="Heading2"/>
+      </w:pPr>
+      <w:r>
         <w:t>2.2.2 Typical Data Flow</w:t>
       </w:r>
     </w:p>
     <w:p>
       <w:r>
-        <w:t>1. User Input: Company admins or Employees add an API URL and configuration via the frontend dashboard.</w:t>
+        <w:t>1. User Input: User (Company Admin or Employee) adds an API URL and configuration via the frontend.</w:t>
       </w:r>
     </w:p>
     <w:p>
       <w:r>
-        <w:t>2. Endpoint Validation: The backend validates the URL and API key.</w:t>
+        <w:t>2. Endpoint Validation: The backend runs a 3-layer check on the URL:</w:t>
       </w:r>
     </w:p>
     <w:p>
       <w:r>
-        <w:t>3. Database Storage: The Flask backend stores the endpoint details with correct ownership tracking (user_id and created_by) in PostgreSQL.</w:t>
+        <w:t>- Layer 1: Static blacklist of known dummy hosts (e.g., mockapi.io, dummyjson.com).</w:t>
       </w:r>
     </w:p>
     <w:p>
       <w:r>
-        <w:t>4. Monitoring Cycle: The background engine fetches active endpoints and pings them at defined intervals.</w:t>
+        <w:t>- Layer 2: DNS resolution check -- if the domain does not resolve, it is immediately rejected.</w:t>
       </w:r>
     </w:p>
     <w:p>
       <w:r>
-        <w:t>5. Logging: Results (status code, latency, API key status) are logged into the monitoring_logs table.</w:t>
+        <w:t>- Layer 3: VirusTotal API domain reputation check -- unknown, malicious, or suspicious domains are rejected.</w:t>
       </w:r>
     </w:p>
     <w:p>
       <w:r>
-        <w:t>6. Notification: If failure criteria are met (consecutive failures or rate limits), the Alert Service triggers an SMTP email to the employee and company admin.</w:t>
+        <w:t>3. Database Storage: If the URL passes all checks, the Flask backend stores the endpoint details with hierarchical user tracking (`user_id` for company, `created_by` for employee) in Supabase (Postgres).</w:t>
       </w:r>
     </w:p>
     <w:p>
       <w:r>
-        <w:t>7. Visualization: The dashboard fetches aggregated metrics via the REST API to render Chart.js graphs.</w:t>
+        <w:t>4. Monitoring Cycle: The APScheduler-based engine fetches active endpoints and pings them.</w:t>
       </w:r>
     </w:p>
     <w:p>
       <w:r>
-        <w:rPr>
-          <w:b/>
-        </w:rPr>
+        <w:t>5. Logging: Results (status code, latency, api key validity) are logged into the `monitoring_logs` table.</w:t>
+      </w:r>
+    </w:p>
+    <w:p>
+      <w:r>
+        <w:t>6. Notification: If failure criteria are met (consecutive failures or rate limiting), the Alert Service triggers an SMTP email to the responsible user and company admin.</w:t>
+      </w:r>
+    </w:p>
+    <w:p>
+      <w:r>
+        <w:t>7. Visualization: The dashboard fetches logs via the REST API to render Chart.js graphs.</w:t>
+      </w:r>
+    </w:p>
+    <w:p>
+      <w:pPr>
+        <w:pStyle w:val="Heading2"/>
+      </w:pPr>
+      <w:r>
         <w:t>2.2.3 User Classes and Characteristics</w:t>
       </w:r>
     </w:p>
@@ -167,10 +566,10 @@
         <w:rPr>
           <w:b/>
         </w:rPr>
-        <w:t>Company Administrators:</w:t>
+        <w:t>Company Administrators</w:t>
       </w:r>
       <w:r>
-        <w:t xml:space="preserve"> Users who own the primary account, have full visibility over all endpoints created by the company and its employees.</w:t>
+        <w:t>: Users who own the primary account, handle billing, and have full visibility over all endpoints and analytics across the company.</w:t>
       </w:r>
     </w:p>
     <w:p>
@@ -181,17 +580,17 @@
         <w:rPr>
           <w:b/>
         </w:rPr>
-        <w:t>Employees:</w:t>
+        <w:t>Employees</w:t>
       </w:r>
       <w:r>
-        <w:t xml:space="preserve"> Sub-accounts invited by the Company Admin. They can add, manage, and monitor only their own specific API endpoints.</w:t>
+        <w:t>: Invited sub-accounts. Developers or system administrators who add and monitor specific API pipelines. They have scoped access to their own dashboard and endpoints.</w:t>
       </w:r>
     </w:p>
     <w:p>
+      <w:pPr>
+        <w:pStyle w:val="Heading2"/>
+      </w:pPr>
       <w:r>
-        <w:rPr>
-          <w:b/>
-        </w:rPr>
         <w:t>2.2.4 Operating Environment</w:t>
       </w:r>
     </w:p>
@@ -203,10 +602,10 @@
         <w:rPr>
           <w:b/>
         </w:rPr>
-        <w:t>Server Side:</w:t>
+        <w:t>Server Side</w:t>
       </w:r>
       <w:r>
-        <w:t xml:space="preserve"> Python 3.10+, Flask, Waitress/Gunicorn, PostgreSQL (Supabase).</w:t>
+        <w:t>: Python 3.10+, Flask, Waitress/Gunicorn, Supabase (Cloud Database PostgreSQL).</w:t>
       </w:r>
     </w:p>
     <w:p>
@@ -217,10 +616,10 @@
         <w:rPr>
           <w:b/>
         </w:rPr>
-        <w:t>Client Side:</w:t>
+        <w:t>Client Side</w:t>
       </w:r>
       <w:r>
-        <w:t xml:space="preserve"> Any modern web browser (Chrome, Firefox, Safari, Edge).</w:t>
+        <w:t>: Any modern web browser (Chrome, Firefox, Safari, Edge).</w:t>
       </w:r>
     </w:p>
     <w:p>
@@ -231,28 +630,28 @@
         <w:rPr>
           <w:b/>
         </w:rPr>
-        <w:t>Hosting:</w:t>
+        <w:t>Hosting</w:t>
       </w:r>
       <w:r>
-        <w:t xml:space="preserve"> Vercel (Web Server), Background Engine Threading.</w:t>
+        <w:t>: Vercel (Frontend/API) and dedicated worker threading for background engines.</w:t>
       </w:r>
     </w:p>
     <w:p>
+      <w:pPr>
+        <w:pStyle w:val="Heading2"/>
+      </w:pPr>
       <w:r>
-        <w:rPr>
-          <w:b/>
-        </w:rPr>
         <w:t>2.2.5 Design and Implementation Constraints / Assumptions</w:t>
       </w:r>
     </w:p>
     <w:p>
       <w:r>
-        <w:t>- The system depends on the availability of the PostgreSQL API.</w:t>
+        <w:t>- The system depends on the availability of the Supabase API and uses a custom DBWrapper to handle serverless connection pooling limits.</w:t>
       </w:r>
     </w:p>
     <w:p>
       <w:r>
-        <w:t>- Monitoring frequency is fixed at 60 seconds.</w:t>
+        <w:t>- Monitoring frequency is fixed at 60 seconds unless configured otherwise.</w:t>
       </w:r>
     </w:p>
     <w:p>
@@ -262,14 +661,14 @@
     </w:p>
     <w:p>
       <w:r>
-        <w:t>- Serverless scaling on Vercel requires custom DBWrappers to prevent connection pool starvation.</w:t>
+        <w:t>- The VirusTotal API has a rate limit of 4 requests per minute on the free tier.</w:t>
       </w:r>
     </w:p>
     <w:p>
+      <w:pPr>
+        <w:pStyle w:val="Heading2"/>
+      </w:pPr>
       <w:r>
-        <w:rPr>
-          <w:b/>
-        </w:rPr>
         <w:t>2.2.6 How Dynamic Website Works</w:t>
       </w:r>
     </w:p>
@@ -285,7 +684,7 @@
     </w:p>
     <w:p>
       <w:r>
-        <w:t>- The Backend (Flask) acts as a REST API server, handling authentication, data aggregation, and database logic.</w:t>
+        <w:t>- The Backend (Flask) acts as a REST API server, handling authentication, database logic, cache invalidation, and URL reputation checks.</w:t>
       </w:r>
     </w:p>
     <w:p>
@@ -295,9 +694,14 @@
     </w:p>
     <w:p>
       <w:r>
-        <w:rPr>
-          <w:b/>
-        </w:rPr>
+        <w:t>- The URL Reputation Service integrates with VirusTotal API v3 and local DNS checks to validate endpoint legitimacy before adding them to the database.</w:t>
+      </w:r>
+    </w:p>
+    <w:p>
+      <w:pPr>
+        <w:pStyle w:val="Heading2"/>
+      </w:pPr>
+      <w:r>
         <w:t>2.2.7 Assumptions and Dependencies</w:t>
       </w:r>
     </w:p>
@@ -309,10 +713,10 @@
         <w:rPr>
           <w:b/>
         </w:rPr>
-        <w:t>Assumed Browser:</w:t>
+        <w:t>Assumed Browser</w:t>
       </w:r>
       <w:r>
-        <w:t xml:space="preserve"> HTML5 and ES6 compatibility.</w:t>
+        <w:t>: HTML5 and ES6 compatibility.</w:t>
       </w:r>
     </w:p>
     <w:p>
@@ -323,10 +727,10 @@
         <w:rPr>
           <w:b/>
         </w:rPr>
-        <w:t>Internet Discovery:</w:t>
+        <w:t>Internet Discovery</w:t>
       </w:r>
       <w:r>
-        <w:t xml:space="preserve"> Users must have a stable internet connection to access the dashboard.</w:t>
+        <w:t>: Users must have a stable internet connection to access the dashboard.</w:t>
       </w:r>
     </w:p>
     <w:p>
@@ -337,47 +741,10 @@
         <w:rPr>
           <w:b/>
         </w:rPr>
-        <w:t>Email Service:</w:t>
+        <w:t>Email Service</w:t>
       </w:r>
       <w:r>
-        <w:t xml:space="preserve"> Assumes the user provides a valid email address for alerts.</w:t>
-      </w:r>
-    </w:p>
-    <w:p>
-      <w:pPr>
-        <w:pStyle w:val="Heading2"/>
-      </w:pPr>
-      <w:r>
-        <w:t>2.3 Functional Requirements</w:t>
-      </w:r>
-    </w:p>
-    <w:p>
-      <w:r>
-        <w:rPr>
-          <w:b/>
-        </w:rPr>
-        <w:t>2.3.1 Core Functionality Description</w:t>
-      </w:r>
-    </w:p>
-    <w:p>
-      <w:r>
-        <w:t>The system provides a seamless experience for monitoring APIs across a company structure. Users can define endpoints (URL, Method, Interval, API keys), and the system ensures they are reachable and valid. The dashboard provides a "NOC-style" view of all monitored services, isolating data so employees only see their scope, while companies see aggregate overviews.</w:t>
-      </w:r>
-    </w:p>
-    <w:p>
-      <w:r>
-        <w:rPr>
-          <w:b/>
-        </w:rPr>
-        <w:t>2.3.2 External Interface Requirements</w:t>
-      </w:r>
-    </w:p>
-    <w:p>
-      <w:r>
-        <w:rPr>
-          <w:b/>
-        </w:rPr>
-        <w:t>2.3.2.1 User Interface</w:t>
+        <w:t>: Assumes the user provides a valid email address for alerts.</w:t>
       </w:r>
     </w:p>
     <w:p>
@@ -388,10 +755,44 @@
         <w:rPr>
           <w:b/>
         </w:rPr>
-        <w:t>Landing Page:</w:t>
+        <w:t>VirusTotal API</w:t>
       </w:r>
       <w:r>
-        <w:t xml:space="preserve"> Modern centered glassmorphic login/registration card.</w:t>
+        <w:t>: Requires a valid API key for domain reputation analysis.</w:t>
+      </w:r>
+    </w:p>
+    <w:p>
+      <w:pPr>
+        <w:pStyle w:val="Heading1"/>
+      </w:pPr>
+      <w:r>
+        <w:t>2.3 Functional Requirements</w:t>
+      </w:r>
+    </w:p>
+    <w:p>
+      <w:pPr>
+        <w:pStyle w:val="Heading2"/>
+      </w:pPr>
+      <w:r>
+        <w:t>2.3.1 Core Functionality Description</w:t>
+      </w:r>
+    </w:p>
+    <w:p>
+      <w:r>
+        <w:t>The system provides a seamless experience for monitoring APIs across an entire organization. Users can define endpoints (URL, Method, Interval), and the system ensures they are reachable. The dashboard provides a "NOC-style" view of all monitored services. Before any endpoint is added, a multi-layer validation engine checks the URL against a static blacklist, performs DNS resolution, and queries VirusTotal for domain reputation to prevent dummy or mock APIs from being monitored.</w:t>
+      </w:r>
+    </w:p>
+    <w:p>
+      <w:pPr>
+        <w:pStyle w:val="Heading2"/>
+      </w:pPr>
+      <w:r>
+        <w:t>2.3.2 External Interface Requirements</w:t>
+      </w:r>
+    </w:p>
+    <w:p>
+      <w:r>
+        <w:t>#### 2.3.2.1 User Interface</w:t>
       </w:r>
     </w:p>
     <w:p>
@@ -402,10 +803,10 @@
         <w:rPr>
           <w:b/>
         </w:rPr>
-        <w:t>Dashboard:</w:t>
+        <w:t>Landing Page</w:t>
       </w:r>
       <w:r>
-        <w:t xml:space="preserve"> Sidebar navigation with dynamic content area, health status cards, and responsive Chart.js charts.</w:t>
+        <w:t>: Modern centered glassmorphic login/registration card.</w:t>
       </w:r>
     </w:p>
     <w:p>
@@ -416,31 +817,10 @@
         <w:rPr>
           <w:b/>
         </w:rPr>
-        <w:t>Modals:</w:t>
+        <w:t>Dashboard</w:t>
       </w:r>
       <w:r>
-        <w:t xml:space="preserve"> For adding/editing endpoints and inviting employees.</w:t>
-      </w:r>
-    </w:p>
-    <w:p>
-      <w:r>
-        <w:rPr>
-          <w:b/>
-        </w:rPr>
-        <w:t>2.3.2.2 Hardware Interfaces</w:t>
-      </w:r>
-    </w:p>
-    <w:p>
-      <w:r>
-        <w:t>No specialized hardware required. Standard Server/PC with NIC.</w:t>
-      </w:r>
-    </w:p>
-    <w:p>
-      <w:r>
-        <w:rPr>
-          <w:b/>
-        </w:rPr>
-        <w:t>2.3.2.3 Software Interfaces</w:t>
+        <w:t>: Sidebar navigation with dynamic content area, health status cards, and responsive charts.</w:t>
       </w:r>
     </w:p>
     <w:p>
@@ -451,10 +831,10 @@
         <w:rPr>
           <w:b/>
         </w:rPr>
-        <w:t>Web Browser:</w:t>
+        <w:t>Modals</w:t>
       </w:r>
       <w:r>
-        <w:t xml:space="preserve"> Chrome 90+, Firefox 88+.</w:t>
+        <w:t>: For adding/editing endpoints with animated error messages (shake animation) for invalid or dummy APIs.</w:t>
       </w:r>
     </w:p>
     <w:p>
@@ -465,10 +845,25 @@
         <w:rPr>
           <w:b/>
         </w:rPr>
-        <w:t>Database:</w:t>
+        <w:t>Error Alerts</w:t>
       </w:r>
       <w:r>
-        <w:t xml:space="preserve"> Supabase (PostgreSQL).</w:t>
+        <w:t>: In-modal animated alerts with slide-in and shake effects for immediate user feedback on validation failures.</w:t>
+      </w:r>
+    </w:p>
+    <w:p>
+      <w:r>
+        <w:t>#### 2.3.2.2 Hardware Interfaces</w:t>
+      </w:r>
+    </w:p>
+    <w:p>
+      <w:r>
+        <w:t>No specialized hardware required. Standard Server/PC with NIC.</w:t>
+      </w:r>
+    </w:p>
+    <w:p>
+      <w:r>
+        <w:t>#### 2.3.2.3 Software Interfaces</w:t>
       </w:r>
     </w:p>
     <w:p>
@@ -479,10 +874,10 @@
         <w:rPr>
           <w:b/>
         </w:rPr>
-        <w:t>Backend Framework:</w:t>
+        <w:t>Web Browser</w:t>
       </w:r>
       <w:r>
-        <w:t xml:space="preserve"> Flask (Python).</w:t>
+        <w:t>: Chrome 90+, Firefox 88+.</w:t>
       </w:r>
     </w:p>
     <w:p>
@@ -493,18 +888,10 @@
         <w:rPr>
           <w:b/>
         </w:rPr>
-        <w:t>Libraries:</w:t>
+        <w:t>Database</w:t>
       </w:r>
       <w:r>
-        <w:t xml:space="preserve"> Chart.js for visualization, APScheduler for tasks.</w:t>
-      </w:r>
-    </w:p>
-    <w:p>
-      <w:r>
-        <w:rPr>
-          <w:b/>
-        </w:rPr>
-        <w:t>2.3.2.4 Communication Interfaces</w:t>
+        <w:t>: Supabase (PostgreSQL).</w:t>
       </w:r>
     </w:p>
     <w:p>
@@ -515,10 +902,10 @@
         <w:rPr>
           <w:b/>
         </w:rPr>
-        <w:t>HTTP/HTTPS:</w:t>
+        <w:t>Backend Framework</w:t>
       </w:r>
       <w:r>
-        <w:t xml:space="preserve"> For client-server communication and API pings.</w:t>
+        <w:t>: Flask (Python).</w:t>
       </w:r>
     </w:p>
     <w:p>
@@ -529,36 +916,71 @@
         <w:rPr>
           <w:b/>
         </w:rPr>
-        <w:t>SMTP:</w:t>
+        <w:t>Libraries</w:t>
       </w:r>
       <w:r>
-        <w:t xml:space="preserve"> For sending critical failure alerts.</w:t>
+        <w:t>: Chart.js for visualization, APScheduler for tasks.</w:t>
+      </w:r>
+    </w:p>
+    <w:p>
+      <w:pPr>
+        <w:pStyle w:val="ListBullet"/>
+      </w:pPr>
+      <w:r>
+        <w:rPr>
+          <w:b/>
+        </w:rPr>
+        <w:t>External APIs</w:t>
+      </w:r>
+      <w:r>
+        <w:t>: VirusTotal API v3 for domain reputation analysis.</w:t>
       </w:r>
     </w:p>
     <w:p>
       <w:r>
-        <w:rPr>
-          <w:b/>
-        </w:rPr>
-        <w:t>2.3.3 Detailed Functional Requirements</w:t>
+        <w:t>#### 2.3.2.4 Communication Interfaces</w:t>
       </w:r>
     </w:p>
     <w:p>
+      <w:pPr>
+        <w:pStyle w:val="ListBullet"/>
+      </w:pPr>
       <w:r>
         <w:rPr>
           <w:b/>
         </w:rPr>
-        <w:t>2.3.3.1 Web Pages Identified</w:t>
+        <w:t>HTTP/HTTPS</w:t>
+      </w:r>
+      <w:r>
+        <w:t>: For client-server communication and API pings.</w:t>
       </w:r>
     </w:p>
     <w:p>
+      <w:pPr>
+        <w:pStyle w:val="ListBullet"/>
+      </w:pPr>
       <w:r>
-        <w:t>- `login.html`: Entry point for all users.</w:t>
+        <w:rPr>
+          <w:b/>
+        </w:rPr>
+        <w:t>SMTP</w:t>
+      </w:r>
+      <w:r>
+        <w:t>: For sending critical failure alerts.</w:t>
       </w:r>
     </w:p>
     <w:p>
+      <w:pPr>
+        <w:pStyle w:val="ListBullet"/>
+      </w:pPr>
       <w:r>
-        <w:t>- `admin.html`: The main control center showing global stats, charts, and endpoint controls.</w:t>
+        <w:rPr>
+          <w:b/>
+        </w:rPr>
+        <w:t>VirusTotal REST API</w:t>
+      </w:r>
+      <w:r>
+        <w:t>: For querying domain reputation data during endpoint validation.</w:t>
       </w:r>
     </w:p>
     <w:p>
@@ -566,15 +988,120 @@
         <w:pStyle w:val="Heading2"/>
       </w:pPr>
       <w:r>
+        <w:t>2.3.3 Detailed Functional Requirements</w:t>
+      </w:r>
+    </w:p>
+    <w:p>
+      <w:r>
+        <w:t>#### 2.3.3.1 Web Pages Identified</w:t>
+      </w:r>
+    </w:p>
+    <w:p>
+      <w:r>
+        <w:t>- `landing.html`: Entry point for guest users.</w:t>
+      </w:r>
+    </w:p>
+    <w:p>
+      <w:r>
+        <w:t>- `index.html`: Login and Registration portal.</w:t>
+      </w:r>
+    </w:p>
+    <w:p>
+      <w:r>
+        <w:t>- `dashboard.html` / `admin.html`: The main control center showing global stats.</w:t>
+      </w:r>
+    </w:p>
+    <w:p>
+      <w:r>
+        <w:t>- `api-endpoints.html`: Detailed list of monitored APIs with management controls and "Add Endpoint" modal.</w:t>
+      </w:r>
+    </w:p>
+    <w:p>
+      <w:r>
+        <w:t>- `profile.html`: User account and notification settings.</w:t>
+      </w:r>
+    </w:p>
+    <w:p>
+      <w:r>
+        <w:t>#### 2.3.3.2 Dummy API Detection Module</w:t>
+      </w:r>
+    </w:p>
+    <w:p>
+      <w:r>
+        <w:t>The system implements a 3-layer security gate for URL validation:</w:t>
+      </w:r>
+    </w:p>
+    <w:p>
+      <w:pPr>
+        <w:pStyle w:val="ListBullet"/>
+      </w:pPr>
+      <w:r>
+        <w:rPr>
+          <w:b/>
+        </w:rPr>
+        <w:t>Layer 1 -- Static Blacklist</w:t>
+      </w:r>
+      <w:r>
+        <w:t>: A curated list of known mock API providers (mockapi.io, dummyjson.com, beeceptor.com, etc.) is maintained on the server. Any URL matching these hosts is instantly rejected.</w:t>
+      </w:r>
+    </w:p>
+    <w:p>
+      <w:pPr>
+        <w:pStyle w:val="ListBullet"/>
+      </w:pPr>
+      <w:r>
+        <w:rPr>
+          <w:b/>
+        </w:rPr>
+        <w:t>Layer 2 -- DNS Resolution</w:t>
+      </w:r>
+      <w:r>
+        <w:t>: The system attempts to resolve the domain via DNS. If the domain does not exist (e.g., data.nexoraapi.io), it is rejected immediately with the message "Domain does not exist (DNS resolution failed)."</w:t>
+      </w:r>
+    </w:p>
+    <w:p>
+      <w:pPr>
+        <w:pStyle w:val="ListBullet"/>
+      </w:pPr>
+      <w:r>
+        <w:rPr>
+          <w:b/>
+        </w:rPr>
+        <w:t>Layer 3 -- VirusTotal Reputation</w:t>
+      </w:r>
+      <w:r>
+        <w:t>: For domains that pass DNS, the system queries the VirusTotal API v3 (`/api/v3/domains/{host}`) to check:</w:t>
+      </w:r>
+    </w:p>
+    <w:p>
+      <w:r>
+        <w:t>- Reputation score (negative = blocked).</w:t>
+      </w:r>
+    </w:p>
+    <w:p>
+      <w:r>
+        <w:t>- Malicious/suspicious detection count.</w:t>
+      </w:r>
+    </w:p>
+    <w:p>
+      <w:r>
+        <w:t>- Analysis coverage (zero coverage = blocked as unknown).</w:t>
+      </w:r>
+    </w:p>
+    <w:p>
+      <w:pPr>
+        <w:pStyle w:val="Heading1"/>
+      </w:pPr>
+      <w:r>
         <w:t>Non-Functional Requirements</w:t>
       </w:r>
     </w:p>
     <w:p>
+      <w:pPr>
+        <w:pStyle w:val="Heading2"/>
+      </w:pPr>
       <w:r>
-        <w:rPr>
-          <w:b/>
-        </w:rPr>
-        <w:t>Security:</w:t>
+        <w:t>Security</w:t>
       </w:r>
     </w:p>
     <w:p>
@@ -589,7 +1116,7 @@
     </w:p>
     <w:p>
       <w:r>
-        <w:t>- Multi-Tenant Isolation using `company_id` and `created_by` attributes.</w:t>
+        <w:t>- Multi-Tenant Data Isolation using hierarchical database columns to prevent leakage between users.</w:t>
       </w:r>
     </w:p>
     <w:p>
@@ -599,15 +1126,20 @@
     </w:p>
     <w:p>
       <w:r>
-        <w:t>- Secure connection pool management.</w:t>
+        <w:t>- Pre-flight API key pattern matching to reject known test key formats.</w:t>
       </w:r>
     </w:p>
     <w:p>
       <w:r>
-        <w:rPr>
-          <w:b/>
-        </w:rPr>
-        <w:t>Performance:</w:t>
+        <w:t>- VirusTotal-powered domain reputation checks to prevent fake endpoints.</w:t>
+      </w:r>
+    </w:p>
+    <w:p>
+      <w:pPr>
+        <w:pStyle w:val="Heading2"/>
+      </w:pPr>
+      <w:r>
+        <w:t>Performance</w:t>
       </w:r>
     </w:p>
     <w:p>
@@ -617,33 +1149,43 @@
     </w:p>
     <w:p>
       <w:r>
-        <w:t>- Dashboard stats aggregation returned in under 200ms using caching.</w:t>
+        <w:t>- Dashboard page load less than 2 seconds, utilizing memory caching.</w:t>
       </w:r>
     </w:p>
     <w:p>
       <w:r>
-        <w:rPr>
-          <w:b/>
-        </w:rPr>
-        <w:t>Scalability:</w:t>
+        <w:t>- Static blacklist and DNS checks complete in less than 100ms.</w:t>
       </w:r>
     </w:p>
     <w:p>
       <w:r>
-        <w:t>- PostgreSQL handles concurrent database connections reliably.</w:t>
+        <w:t>- VirusTotal check completes within 10 seconds (with timeout fallback).</w:t>
+      </w:r>
+    </w:p>
+    <w:p>
+      <w:pPr>
+        <w:pStyle w:val="Heading2"/>
+      </w:pPr>
+      <w:r>
+        <w:t>Scalability</w:t>
       </w:r>
     </w:p>
     <w:p>
       <w:r>
-        <w:t>- Flask backend is stateless for horizontal serverless scaling.</w:t>
+        <w:t>- Supabase handles concurrent database connections reliably.</w:t>
       </w:r>
     </w:p>
     <w:p>
       <w:r>
-        <w:rPr>
-          <w:b/>
-        </w:rPr>
-        <w:t>Availability:</w:t>
+        <w:t>- Flask backend is stateless for horizontal scaling.</w:t>
+      </w:r>
+    </w:p>
+    <w:p>
+      <w:pPr>
+        <w:pStyle w:val="Heading2"/>
+      </w:pPr>
+      <w:r>
+        <w:t>Availability</w:t>
       </w:r>
     </w:p>
     <w:p>
@@ -652,11 +1194,11 @@
       </w:r>
     </w:p>
     <w:p>
+      <w:pPr>
+        <w:pStyle w:val="Heading2"/>
+      </w:pPr>
       <w:r>
-        <w:rPr>
-          <w:b/>
-        </w:rPr>
-        <w:t>Usability:</w:t>
+        <w:t>Usability</w:t>
       </w:r>
     </w:p>
     <w:p>
@@ -665,8 +1207,13 @@
       </w:r>
     </w:p>
     <w:p>
+      <w:r>
+        <w:t>- Animated error messages (slide-in + shake) for failed validations.</w:t>
+      </w:r>
+    </w:p>
+    <w:p>
       <w:pPr>
-        <w:pStyle w:val="Heading2"/>
+        <w:pStyle w:val="Heading1"/>
       </w:pPr>
       <w:r>
         <w:t>2.4 Advantages of the System</w:t>
@@ -680,10 +1227,10 @@
         <w:rPr>
           <w:b/>
         </w:rPr>
-        <w:t>Real-time Awareness:</w:t>
+        <w:t>Real-time Awareness</w:t>
       </w:r>
       <w:r>
-        <w:t xml:space="preserve"> Users know immediately when their API is down or degrading.</w:t>
+        <w:t>: Users know immediately when their API is down.</w:t>
       </w:r>
     </w:p>
     <w:p>
@@ -694,10 +1241,10 @@
         <w:rPr>
           <w:b/>
         </w:rPr>
-        <w:t>Data-Driven Insights:</w:t>
+        <w:t>Data-Driven Insights</w:t>
       </w:r>
       <w:r>
-        <w:t xml:space="preserve"> Uptime and latency charts help identify performance regressions.</w:t>
+        <w:t>: Uptime and latency charts help identify performance regressions.</w:t>
       </w:r>
     </w:p>
     <w:p>
@@ -708,10 +1255,10 @@
         <w:rPr>
           <w:b/>
         </w:rPr>
-        <w:t>Corporate Hierarchy Control:</w:t>
+        <w:t>Enterprise Hierarchy</w:t>
       </w:r>
       <w:r>
-        <w:t xml:space="preserve"> Perfect data isolation between company admins and employee sub-accounts.</w:t>
+        <w:t>: Deeply nested permissions allow company administration over employee workspaces.</w:t>
       </w:r>
     </w:p>
     <w:p>
@@ -722,15 +1269,57 @@
         <w:rPr>
           <w:b/>
         </w:rPr>
-        <w:t>Secure by Design:</w:t>
+        <w:t>Low Barrier to Entry</w:t>
       </w:r>
       <w:r>
-        <w:t xml:space="preserve"> Implementation of strict RBAC ensures user data privacy.</w:t>
+        <w:t>: Easy to set up with existing endpoints.</w:t>
       </w:r>
     </w:p>
     <w:p>
       <w:pPr>
-        <w:pStyle w:val="Heading2"/>
+        <w:pStyle w:val="ListBullet"/>
+      </w:pPr>
+      <w:r>
+        <w:rPr>
+          <w:b/>
+        </w:rPr>
+        <w:t>Secure by Design</w:t>
+      </w:r>
+      <w:r>
+        <w:t>: Implementation of isolated connection pools ensures privacy and reliability.</w:t>
+      </w:r>
+    </w:p>
+    <w:p>
+      <w:pPr>
+        <w:pStyle w:val="ListBullet"/>
+      </w:pPr>
+      <w:r>
+        <w:rPr>
+          <w:b/>
+        </w:rPr>
+        <w:t>Anti-Dummy Protection</w:t>
+      </w:r>
+      <w:r>
+        <w:t>: Industry-first 3-layer validation (Blacklist + DNS + VirusTotal) prevents users from monitoring fake or mock APIs.</w:t>
+      </w:r>
+    </w:p>
+    <w:p>
+      <w:pPr>
+        <w:pStyle w:val="ListBullet"/>
+      </w:pPr>
+      <w:r>
+        <w:rPr>
+          <w:b/>
+        </w:rPr>
+        <w:t>Animated UX Feedback</w:t>
+      </w:r>
+      <w:r>
+        <w:t>: Premium shake and slide-in animations for validation errors provide clear, immediate user feedback.</w:t>
+      </w:r>
+    </w:p>
+    <w:p>
+      <w:pPr>
+        <w:pStyle w:val="Heading1"/>
       </w:pPr>
       <w:r>
         <w:t>2.5 Future Enhancements</w:t>
@@ -744,10 +1333,10 @@
         <w:rPr>
           <w:b/>
         </w:rPr>
-        <w:t>Multi-region Pings:</w:t>
+        <w:t>Multi-region Pings</w:t>
       </w:r>
       <w:r>
-        <w:t xml:space="preserve"> Monitor APIs from different global locations.</w:t>
+        <w:t>: Monitor APIs from different global locations.</w:t>
       </w:r>
     </w:p>
     <w:p>
@@ -758,10 +1347,10 @@
         <w:rPr>
           <w:b/>
         </w:rPr>
-        <w:t>Slack/Discord Webhooks:</w:t>
+        <w:t>Slack/Discord Webhooks</w:t>
       </w:r>
       <w:r>
-        <w:t xml:space="preserve"> Notification support for dev teams.</w:t>
+        <w:t>: Notification support for dev teams.</w:t>
       </w:r>
     </w:p>
     <w:p>
@@ -772,10 +1361,10 @@
         <w:rPr>
           <w:b/>
         </w:rPr>
-        <w:t>AI Diagnostics:</w:t>
+        <w:t>AI Diagnostics</w:t>
       </w:r>
       <w:r>
-        <w:t xml:space="preserve"> Automatically analyze root causes of failures.</w:t>
+        <w:t>: Automatically analyze root causes of failures (e.g., DNS, Timeout, 500 Error).</w:t>
       </w:r>
     </w:p>
     <w:p>
@@ -786,10 +1375,24 @@
         <w:rPr>
           <w:b/>
         </w:rPr>
-        <w:t>Mobile Application:</w:t>
+        <w:t>Mobile Application</w:t>
       </w:r>
       <w:r>
-        <w:t xml:space="preserve"> Native iOS/Android app for on-the-go alerts.</w:t>
+        <w:t>: Native iOS/Android app for on-the-go alerts.</w:t>
+      </w:r>
+    </w:p>
+    <w:p>
+      <w:pPr>
+        <w:pStyle w:val="ListBullet"/>
+      </w:pPr>
+      <w:r>
+        <w:rPr>
+          <w:b/>
+        </w:rPr>
+        <w:t>Custom Blacklist Management</w:t>
+      </w:r>
+      <w:r>
+        <w:t>: Allow users to add their own blacklisted domains via the Admin Panel.</w:t>
       </w:r>
     </w:p>
     <w:sectPr>

</xml_diff>